<commit_message>
Replace previous Lab 3 with adjusted version
</commit_message>
<xml_diff>
--- a/week03/Lab3_Justin Albert.docx
+++ b/week03/Lab3_Justin Albert.docx
@@ -11,6 +11,172 @@
           <w:sz w:val="21"/>
         </w:rPr>
       </w:pPr>
+      <w:r>
+        <w:rPr>
+          <w:rFonts w:ascii="Times New Roman" w:eastAsia="Times New Roman" w:hAnsi="Times New Roman" w:cs="Times New Roman"/>
+          <w:b/>
+          <w:noProof/>
+          <w:color w:val="C9A227"/>
+          <w:sz w:val="18"/>
+        </w:rPr>
+        <mc:AlternateContent>
+          <mc:Choice Requires="wps">
+            <w:drawing>
+              <wp:anchor distT="0" distB="0" distL="114300" distR="114300" simplePos="0" relativeHeight="251659264" behindDoc="0" locked="0" layoutInCell="1" allowOverlap="1" wp14:anchorId="10F13C27" wp14:editId="5E42A82B">
+                <wp:simplePos x="0" y="0"/>
+                <wp:positionH relativeFrom="margin">
+                  <wp:align>right</wp:align>
+                </wp:positionH>
+                <wp:positionV relativeFrom="paragraph">
+                  <wp:posOffset>-276860</wp:posOffset>
+                </wp:positionV>
+                <wp:extent cx="1609725" cy="504825"/>
+                <wp:effectExtent l="0" t="0" r="28575" b="28575"/>
+                <wp:wrapNone/>
+                <wp:docPr id="1987453314" name="Rectangle 2"/>
+                <wp:cNvGraphicFramePr/>
+                <a:graphic xmlns:a="http://schemas.openxmlformats.org/drawingml/2006/main">
+                  <a:graphicData uri="http://schemas.microsoft.com/office/word/2010/wordprocessingShape">
+                    <wps:wsp>
+                      <wps:cNvSpPr/>
+                      <wps:spPr>
+                        <a:xfrm>
+                          <a:off x="0" y="0"/>
+                          <a:ext cx="1609725" cy="504825"/>
+                        </a:xfrm>
+                        <a:prstGeom prst="rect">
+                          <a:avLst/>
+                        </a:prstGeom>
+                        <a:solidFill>
+                          <a:schemeClr val="tx2">
+                            <a:lumMod val="10000"/>
+                            <a:lumOff val="90000"/>
+                          </a:schemeClr>
+                        </a:solidFill>
+                      </wps:spPr>
+                      <wps:style>
+                        <a:lnRef idx="2">
+                          <a:schemeClr val="accent1">
+                            <a:shade val="15000"/>
+                          </a:schemeClr>
+                        </a:lnRef>
+                        <a:fillRef idx="1">
+                          <a:schemeClr val="accent1"/>
+                        </a:fillRef>
+                        <a:effectRef idx="0">
+                          <a:schemeClr val="accent1"/>
+                        </a:effectRef>
+                        <a:fontRef idx="minor">
+                          <a:schemeClr val="lt1"/>
+                        </a:fontRef>
+                      </wps:style>
+                      <wps:txbx>
+                        <w:txbxContent>
+                          <w:p>
+                            <w:pPr>
+                              <w:spacing w:after="0"/>
+                              <w:rPr>
+                                <w:b/>
+                                <w:bCs/>
+                                <w:color w:val="000000" w:themeColor="text1"/>
+                              </w:rPr>
+                            </w:pPr>
+                            <w:r>
+                              <w:rPr>
+                                <w:b/>
+                                <w:bCs/>
+                                <w:color w:val="000000" w:themeColor="text1"/>
+                              </w:rPr>
+                              <w:t>Name: Justin Albert</w:t>
+                            </w:r>
+                          </w:p>
+                          <w:p>
+                            <w:pPr>
+                              <w:spacing w:after="0"/>
+                              <w:rPr>
+                                <w:b/>
+                                <w:bCs/>
+                                <w:color w:val="000000" w:themeColor="text1"/>
+                              </w:rPr>
+                            </w:pPr>
+                            <w:r>
+                              <w:rPr>
+                                <w:b/>
+                                <w:bCs/>
+                                <w:color w:val="000000" w:themeColor="text1"/>
+                              </w:rPr>
+                              <w:t>ID: 00110</w:t>
+                            </w:r>
+                          </w:p>
+                        </w:txbxContent>
+                      </wps:txbx>
+                      <wps:bodyPr rot="0" spcFirstLastPara="0" vertOverflow="overflow" horzOverflow="overflow" vert="horz" wrap="square" lIns="91440" tIns="45720" rIns="91440" bIns="45720" numCol="1" spcCol="0" rtlCol="0" fromWordArt="0" anchor="ctr" anchorCtr="0" forceAA="0" compatLnSpc="1">
+                        <a:prstTxWarp prst="textNoShape">
+                          <a:avLst/>
+                        </a:prstTxWarp>
+                        <a:noAutofit/>
+                      </wps:bodyPr>
+                    </wps:wsp>
+                  </a:graphicData>
+                </a:graphic>
+                <wp14:sizeRelH relativeFrom="margin">
+                  <wp14:pctWidth>0</wp14:pctWidth>
+                </wp14:sizeRelH>
+                <wp14:sizeRelV relativeFrom="margin">
+                  <wp14:pctHeight>0</wp14:pctHeight>
+                </wp14:sizeRelV>
+              </wp:anchor>
+            </w:drawing>
+          </mc:Choice>
+          <mc:Fallback>
+            <w:pict>
+              <v:rect w14:anchorId="10F13C27" id="Rectangle 2" o:spid="_x0000_s1026" style="position:absolute;margin-left:75.55pt;margin-top:-21.8pt;width:126.75pt;height:39.75pt;z-index:251659264;visibility:visible;mso-wrap-style:square;mso-width-percent:0;mso-height-percent:0;mso-wrap-distance-left:9pt;mso-wrap-distance-top:0;mso-wrap-distance-right:9pt;mso-wrap-distance-bottom:0;mso-position-horizontal:right;mso-position-horizontal-relative:margin;mso-position-vertical:absolute;mso-position-vertical-relative:text;mso-width-percent:0;mso-height-percent:0;mso-width-relative:margin;mso-height-relative:margin;v-text-anchor:middle" o:gfxdata="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" fillcolor="#dceaf7 [351]" strokecolor="#030e13 [484]" strokeweight="1.5pt">
+                <v:textbox>
+                  <w:txbxContent>
+                    <w:p>
+                      <w:pPr>
+                        <w:spacing w:after="0"/>
+                        <w:rPr>
+                          <w:b/>
+                          <w:bCs/>
+                          <w:color w:val="000000" w:themeColor="text1"/>
+                        </w:rPr>
+                      </w:pPr>
+                      <w:r>
+                        <w:rPr>
+                          <w:b/>
+                          <w:bCs/>
+                          <w:color w:val="000000" w:themeColor="text1"/>
+                        </w:rPr>
+                        <w:t>Name: Justin Albert</w:t>
+                      </w:r>
+                    </w:p>
+                    <w:p>
+                      <w:pPr>
+                        <w:spacing w:after="0"/>
+                        <w:rPr>
+                          <w:b/>
+                          <w:bCs/>
+                          <w:color w:val="000000" w:themeColor="text1"/>
+                        </w:rPr>
+                      </w:pPr>
+                      <w:r>
+                        <w:rPr>
+                          <w:b/>
+                          <w:bCs/>
+                          <w:color w:val="000000" w:themeColor="text1"/>
+                        </w:rPr>
+                        <w:t>ID: 00110</w:t>
+                      </w:r>
+                    </w:p>
+                  </w:txbxContent>
+                </v:textbox>
+                <w10:wrap anchorx="margin"/>
+              </v:rect>
+            </w:pict>
+          </mc:Fallback>
+        </mc:AlternateContent>
+      </w:r>
       <w:r>
         <w:rPr>
           <w:rFonts w:ascii="Times New Roman" w:eastAsia="Times New Roman" w:hAnsi="Times New Roman" w:cs="Times New Roman"/>
@@ -1014,7 +1180,7 @@
               <w:rPr>
                 <w:rFonts w:ascii="Aptos Body" w:hAnsi="Aptos Body"/>
               </w:rPr>
-              <w:t>Most requirements are known (fee payments, receipts, balances, reports), but some details such as instalment policies and reporting requirements may change after discussions with the school.</w:t>
+              <w:t>Most requirements are known, including fee payments, receipts, balances, and reports. However, some details such as instalment policies and reporting requirements may change after discussions with the bursar and headmaster.</w:t>
             </w:r>
           </w:p>
         </w:tc>
@@ -1040,9 +1206,21 @@
             </w:pPr>
             <w:r>
               <w:rPr>
-                <w:rFonts w:ascii="Aptos Body" w:hAnsi="Aptos Body"/>
-              </w:rPr>
-              <w:t>Incremental / Agile</w:t>
+                <w:rFonts w:ascii="Aptos Body" w:eastAsia="Times New Roman" w:hAnsi="Aptos Body" w:cs="Times New Roman"/>
+                <w:b/>
+                <w:bCs/>
+                <w:color w:val="000000"/>
+                <w:sz w:val="21"/>
+              </w:rPr>
+              <w:t>Incremental Development</w:t>
+            </w:r>
+            <w:r>
+              <w:rPr>
+                <w:rFonts w:ascii="Aptos Body" w:eastAsia="Times New Roman" w:hAnsi="Aptos Body" w:cs="Times New Roman"/>
+                <w:color w:val="000000"/>
+                <w:sz w:val="21"/>
+              </w:rPr>
+              <w:t xml:space="preserve"> because requirements can be refined after each delivery.</w:t>
             </w:r>
           </w:p>
         </w:tc>
@@ -1152,24 +1330,40 @@
             </w:pPr>
             <w:r>
               <w:rPr>
-                <w:rFonts w:ascii="Aptos Body" w:eastAsia="Times New Roman" w:hAnsi="Aptos Body" w:cs="Times New Roman"/>
-                <w:color w:val="000000"/>
-                <w:sz w:val="21"/>
-              </w:rPr>
-              <w:t xml:space="preserve"> </w:t>
-            </w:r>
-            <w:r>
-              <w:rPr>
                 <w:rFonts w:ascii="Aptos Body" w:hAnsi="Aptos Body"/>
               </w:rPr>
-              <w:t xml:space="preserve">Yes. The bursar and headmaster can regularly review the system and provide </w:t>
+              <w:t xml:space="preserve">The bursar and headmaster can </w:t>
             </w:r>
             <w:r>
               <w:rPr>
                 <w:rFonts w:ascii="Aptos Body" w:hAnsi="Aptos Body"/>
               </w:rPr>
+              <w:t>provide the feedback</w:t>
+            </w:r>
+            <w:r>
+              <w:rPr>
+                <w:rFonts w:ascii="Aptos Body" w:hAnsi="Aptos Body"/>
+              </w:rPr>
+              <w:t xml:space="preserve">, </w:t>
+            </w:r>
+            <w:r>
+              <w:rPr>
+                <w:rFonts w:ascii="Aptos Body" w:hAnsi="Aptos Body"/>
+              </w:rPr>
               <w:lastRenderedPageBreak/>
-              <w:t>feedback during development.</w:t>
+              <w:t>but they have teaching and administrative responsibilities, so they are more likely to participate</w:t>
+            </w:r>
+            <w:r>
+              <w:rPr>
+                <w:rFonts w:ascii="Aptos Body" w:hAnsi="Aptos Body"/>
+              </w:rPr>
+              <w:t xml:space="preserve"> in scheduled fortnightly review meetings than daily meetings</w:t>
+            </w:r>
+            <w:r>
+              <w:rPr>
+                <w:rFonts w:ascii="Aptos Body" w:hAnsi="Aptos Body"/>
+              </w:rPr>
+              <w:t>.</w:t>
             </w:r>
           </w:p>
         </w:tc>
@@ -1196,15 +1390,26 @@
             <w:r>
               <w:rPr>
                 <w:rFonts w:ascii="Aptos Body" w:hAnsi="Aptos Body"/>
+                <w:b/>
+                <w:bCs/>
               </w:rPr>
               <w:lastRenderedPageBreak/>
-              <w:t>Agile / Incrementa</w:t>
+              <w:t xml:space="preserve">Incremental Development with planned </w:t>
             </w:r>
             <w:r>
               <w:rPr>
                 <w:rFonts w:ascii="Aptos Body" w:hAnsi="Aptos Body"/>
-              </w:rPr>
-              <w:t>l</w:t>
+                <w:b/>
+                <w:bCs/>
+              </w:rPr>
+              <w:lastRenderedPageBreak/>
+              <w:t>client review sessions</w:t>
+            </w:r>
+            <w:r>
+              <w:rPr>
+                <w:rFonts w:ascii="Aptos Body" w:hAnsi="Aptos Body"/>
+              </w:rPr>
+              <w:t xml:space="preserve"> because feedback can be collected between increments.</w:t>
             </w:r>
           </w:p>
         </w:tc>
@@ -1239,6 +1444,7 @@
                 <w:color w:val="222831"/>
                 <w:sz w:val="20"/>
               </w:rPr>
+              <w:lastRenderedPageBreak/>
               <w:t>3</w:t>
             </w:r>
             <w:r>
@@ -1310,47 +1516,59 @@
                 <w:sz w:val="21"/>
               </w:rPr>
             </w:pPr>
-            <w:r>
-              <w:rPr>
-                <w:rFonts w:ascii="Aptos Body" w:eastAsia="Times New Roman" w:hAnsi="Aptos Body" w:cs="Times New Roman"/>
-                <w:color w:val="000000"/>
-                <w:sz w:val="21"/>
-              </w:rPr>
-              <w:t xml:space="preserve"> </w:t>
-            </w:r>
+          </w:p>
+          <w:p>
+            <w:pPr>
+              <w:spacing w:line="259" w:lineRule="auto"/>
+              <w:rPr>
+                <w:rFonts w:ascii="Aptos Body" w:eastAsia="Times New Roman" w:hAnsi="Aptos Body" w:cs="Times New Roman"/>
+                <w:color w:val="000000"/>
+                <w:sz w:val="21"/>
+              </w:rPr>
+            </w:pPr>
+            <w:r>
+              <w:rPr>
+                <w:rFonts w:ascii="Aptos Body" w:eastAsia="Times New Roman" w:hAnsi="Aptos Body" w:cs="Times New Roman"/>
+                <w:color w:val="000000"/>
+                <w:sz w:val="21"/>
+              </w:rPr>
+              <w:t>The school requires a reliable system that fits within its available budget. There is no indication that government regulations require a fully plan-driven lifecycle, but clear progress reports and approval before deployment are expected.</w:t>
+            </w:r>
+          </w:p>
+        </w:tc>
+        <w:tc>
+          <w:tcPr>
+            <w:tcW w:w="1899" w:type="dxa"/>
+            <w:tcBorders>
+              <w:top w:val="single" w:sz="36" w:space="0" w:color="FFFFFF"/>
+              <w:left w:val="single" w:sz="4" w:space="0" w:color="AFBBD0"/>
+              <w:bottom w:val="single" w:sz="36" w:space="0" w:color="F4F7FC"/>
+              <w:right w:val="single" w:sz="4" w:space="0" w:color="AFBBD0"/>
+            </w:tcBorders>
+            <w:vAlign w:val="center"/>
+          </w:tcPr>
+          <w:p>
+            <w:pPr>
+              <w:spacing w:line="259" w:lineRule="auto"/>
+              <w:rPr>
+                <w:rFonts w:ascii="Aptos Body" w:eastAsia="Times New Roman" w:hAnsi="Aptos Body" w:cs="Times New Roman"/>
+                <w:color w:val="000000"/>
+                <w:sz w:val="21"/>
+              </w:rPr>
+            </w:pPr>
             <w:r>
               <w:rPr>
                 <w:rFonts w:ascii="Aptos Body" w:hAnsi="Aptos Body"/>
-              </w:rPr>
-              <w:t>The school wants a reliable system within its budget. There are no strict government regulations requiring a fixed development process.</w:t>
-            </w:r>
-          </w:p>
-        </w:tc>
-        <w:tc>
-          <w:tcPr>
-            <w:tcW w:w="1899" w:type="dxa"/>
-            <w:tcBorders>
-              <w:top w:val="single" w:sz="36" w:space="0" w:color="FFFFFF"/>
-              <w:left w:val="single" w:sz="4" w:space="0" w:color="AFBBD0"/>
-              <w:bottom w:val="single" w:sz="36" w:space="0" w:color="F4F7FC"/>
-              <w:right w:val="single" w:sz="4" w:space="0" w:color="AFBBD0"/>
-            </w:tcBorders>
-            <w:vAlign w:val="center"/>
-          </w:tcPr>
-          <w:p>
-            <w:pPr>
-              <w:spacing w:line="259" w:lineRule="auto"/>
-              <w:rPr>
-                <w:rFonts w:ascii="Aptos Body" w:eastAsia="Times New Roman" w:hAnsi="Aptos Body" w:cs="Times New Roman"/>
-                <w:color w:val="000000"/>
-                <w:sz w:val="21"/>
-              </w:rPr>
-            </w:pPr>
+                <w:b/>
+                <w:bCs/>
+              </w:rPr>
+              <w:t>Incremental Development with milestone approvals</w:t>
+            </w:r>
             <w:r>
               <w:rPr>
                 <w:rFonts w:ascii="Aptos Body" w:hAnsi="Aptos Body"/>
               </w:rPr>
-              <w:t>Incremental</w:t>
+              <w:t xml:space="preserve"> because the school can review progress before each release.</w:t>
             </w:r>
           </w:p>
         </w:tc>
@@ -1464,75 +1682,77 @@
                 <w:color w:val="000000"/>
                 <w:sz w:val="21"/>
               </w:rPr>
+              <w:t>The project is being developed by one student developer working with staff at Kina Ridge Primary School. A small team benefits from developing and delivering the system in manageable stages.</w:t>
+            </w:r>
+          </w:p>
+        </w:tc>
+        <w:tc>
+          <w:tcPr>
+            <w:tcW w:w="1899" w:type="dxa"/>
+            <w:tcBorders>
+              <w:top w:val="single" w:sz="36" w:space="0" w:color="F4F7FC"/>
+              <w:left w:val="single" w:sz="4" w:space="0" w:color="AFBBD0"/>
+              <w:bottom w:val="single" w:sz="36" w:space="0" w:color="FFFFFF"/>
+              <w:right w:val="single" w:sz="4" w:space="0" w:color="AFBBD0"/>
+            </w:tcBorders>
+            <w:shd w:val="clear" w:color="auto" w:fill="F4F7FC"/>
+          </w:tcPr>
+          <w:p>
+            <w:pPr>
+              <w:spacing w:line="259" w:lineRule="auto"/>
+              <w:rPr>
+                <w:rFonts w:ascii="Aptos Body" w:eastAsia="Times New Roman" w:hAnsi="Aptos Body" w:cs="Times New Roman"/>
+                <w:color w:val="000000"/>
+                <w:sz w:val="21"/>
+              </w:rPr>
+            </w:pPr>
+            <w:r>
+              <w:rPr>
+                <w:rFonts w:ascii="Aptos Body" w:eastAsia="Times New Roman" w:hAnsi="Aptos Body" w:cs="Times New Roman"/>
+                <w:color w:val="000000"/>
+                <w:sz w:val="21"/>
+              </w:rPr>
               <w:t xml:space="preserve"> </w:t>
             </w:r>
+          </w:p>
+          <w:p>
+            <w:pPr>
+              <w:rPr>
+                <w:rFonts w:ascii="Aptos Body" w:eastAsia="Times New Roman" w:hAnsi="Aptos Body" w:cs="Times New Roman"/>
+                <w:color w:val="000000"/>
+                <w:sz w:val="21"/>
+              </w:rPr>
+            </w:pPr>
+          </w:p>
+          <w:p>
+            <w:pPr>
+              <w:rPr>
+                <w:rFonts w:ascii="Aptos Body" w:eastAsia="Times New Roman" w:hAnsi="Aptos Body" w:cs="Times New Roman"/>
+                <w:color w:val="000000"/>
+                <w:sz w:val="21"/>
+              </w:rPr>
+            </w:pPr>
+          </w:p>
+          <w:p>
+            <w:pPr>
+              <w:rPr>
+                <w:rFonts w:ascii="Aptos Body" w:eastAsia="Times New Roman" w:hAnsi="Aptos Body" w:cs="Times New Roman"/>
+                <w:sz w:val="21"/>
+              </w:rPr>
+            </w:pPr>
             <w:r>
               <w:rPr>
                 <w:rFonts w:ascii="Aptos Body" w:hAnsi="Aptos Body"/>
-              </w:rPr>
-              <w:t>The project is completed by one student developer working closely with the school in Port Moresby.</w:t>
-            </w:r>
-          </w:p>
-        </w:tc>
-        <w:tc>
-          <w:tcPr>
-            <w:tcW w:w="1899" w:type="dxa"/>
-            <w:tcBorders>
-              <w:top w:val="single" w:sz="36" w:space="0" w:color="F4F7FC"/>
-              <w:left w:val="single" w:sz="4" w:space="0" w:color="AFBBD0"/>
-              <w:bottom w:val="single" w:sz="36" w:space="0" w:color="FFFFFF"/>
-              <w:right w:val="single" w:sz="4" w:space="0" w:color="AFBBD0"/>
-            </w:tcBorders>
-            <w:shd w:val="clear" w:color="auto" w:fill="F4F7FC"/>
-          </w:tcPr>
-          <w:p>
-            <w:pPr>
-              <w:spacing w:line="259" w:lineRule="auto"/>
-              <w:rPr>
-                <w:rFonts w:ascii="Aptos Body" w:eastAsia="Times New Roman" w:hAnsi="Aptos Body" w:cs="Times New Roman"/>
-                <w:color w:val="000000"/>
-                <w:sz w:val="21"/>
-              </w:rPr>
-            </w:pPr>
-            <w:r>
-              <w:rPr>
-                <w:rFonts w:ascii="Aptos Body" w:eastAsia="Times New Roman" w:hAnsi="Aptos Body" w:cs="Times New Roman"/>
-                <w:color w:val="000000"/>
-                <w:sz w:val="21"/>
-              </w:rPr>
-              <w:t xml:space="preserve"> </w:t>
-            </w:r>
-          </w:p>
-          <w:p>
-            <w:pPr>
-              <w:rPr>
-                <w:rFonts w:ascii="Aptos Body" w:eastAsia="Times New Roman" w:hAnsi="Aptos Body" w:cs="Times New Roman"/>
-                <w:color w:val="000000"/>
-                <w:sz w:val="21"/>
-              </w:rPr>
-            </w:pPr>
-          </w:p>
-          <w:p>
-            <w:pPr>
-              <w:rPr>
-                <w:rFonts w:ascii="Aptos Body" w:eastAsia="Times New Roman" w:hAnsi="Aptos Body" w:cs="Times New Roman"/>
-                <w:color w:val="000000"/>
-                <w:sz w:val="21"/>
-              </w:rPr>
-            </w:pPr>
-          </w:p>
-          <w:p>
-            <w:pPr>
-              <w:rPr>
-                <w:rFonts w:ascii="Aptos Body" w:eastAsia="Times New Roman" w:hAnsi="Aptos Body" w:cs="Times New Roman"/>
-                <w:sz w:val="21"/>
-              </w:rPr>
-            </w:pPr>
+                <w:b/>
+                <w:bCs/>
+              </w:rPr>
+              <w:t>Incremental Development</w:t>
+            </w:r>
             <w:r>
               <w:rPr>
                 <w:rFonts w:ascii="Aptos Body" w:hAnsi="Aptos Body"/>
               </w:rPr>
-              <w:t>Incremental</w:t>
+              <w:t xml:space="preserve"> because smaller releases are easier to manage with a small team.</w:t>
             </w:r>
           </w:p>
         </w:tc>
@@ -1644,27 +1864,31 @@
                 <w:color w:val="000000"/>
                 <w:sz w:val="21"/>
               </w:rPr>
-              <w:t xml:space="preserve"> </w:t>
-            </w:r>
-            <w:r>
+              <w:t>The cost of failure is high because incorrect fee records, lost payment information, or inaccurate balances could affect parents, students, and the school's financial management.</w:t>
+            </w:r>
+          </w:p>
+        </w:tc>
+        <w:tc>
+          <w:tcPr>
+            <w:tcW w:w="1899" w:type="dxa"/>
+            <w:tcBorders>
+              <w:top w:val="single" w:sz="36" w:space="0" w:color="FFFFFF"/>
+              <w:left w:val="single" w:sz="4" w:space="0" w:color="AFBBD0"/>
+              <w:bottom w:val="single" w:sz="36" w:space="0" w:color="F4F7FC"/>
+              <w:right w:val="single" w:sz="4" w:space="0" w:color="AFBBD0"/>
+            </w:tcBorders>
+            <w:vAlign w:val="center"/>
+          </w:tcPr>
+          <w:p>
+            <w:pPr>
+              <w:spacing w:line="259" w:lineRule="auto"/>
               <w:rPr>
                 <w:rFonts w:ascii="Aptos Body" w:hAnsi="Aptos Body"/>
-              </w:rPr>
-              <w:t>High. Incorrect fee records or lost payment information could affect parents, students, and the school's finances.</w:t>
-            </w:r>
-          </w:p>
-        </w:tc>
-        <w:tc>
-          <w:tcPr>
-            <w:tcW w:w="1899" w:type="dxa"/>
-            <w:tcBorders>
-              <w:top w:val="single" w:sz="36" w:space="0" w:color="FFFFFF"/>
-              <w:left w:val="single" w:sz="4" w:space="0" w:color="AFBBD0"/>
-              <w:bottom w:val="single" w:sz="36" w:space="0" w:color="F4F7FC"/>
-              <w:right w:val="single" w:sz="4" w:space="0" w:color="AFBBD0"/>
-            </w:tcBorders>
-            <w:vAlign w:val="center"/>
-          </w:tcPr>
+                <w:b/>
+                <w:bCs/>
+              </w:rPr>
+            </w:pPr>
+          </w:p>
           <w:p>
             <w:pPr>
               <w:spacing w:line="259" w:lineRule="auto"/>
@@ -1677,8 +1901,16 @@
             <w:r>
               <w:rPr>
                 <w:rFonts w:ascii="Aptos Body" w:hAnsi="Aptos Body"/>
-              </w:rPr>
-              <w:t>Waterfall elements (careful testing)</w:t>
+                <w:b/>
+                <w:bCs/>
+              </w:rPr>
+              <w:t>Waterfall practices for testing, documentation, and validation</w:t>
+            </w:r>
+            <w:r>
+              <w:rPr>
+                <w:rFonts w:ascii="Aptos Body" w:hAnsi="Aptos Body"/>
+              </w:rPr>
+              <w:t xml:space="preserve"> because financial data requires careful verification before release.</w:t>
             </w:r>
           </w:p>
         </w:tc>
@@ -1796,7 +2028,14 @@
               <w:rPr>
                 <w:rFonts w:ascii="Aptos Body" w:hAnsi="Aptos Body"/>
               </w:rPr>
-              <w:t>The school needs a working payment recording system as soon as possible to replace manual record keeping.</w:t>
+              <w:t xml:space="preserve">The school currently relies on manual </w:t>
+            </w:r>
+            <w:r>
+              <w:rPr>
+                <w:rFonts w:ascii="Aptos Body" w:hAnsi="Aptos Body"/>
+              </w:rPr>
+              <w:lastRenderedPageBreak/>
+              <w:t>records, so it needs a working payment recording system as soon as possible to improve efficiency and reduce errors.</w:t>
             </w:r>
           </w:p>
         </w:tc>
@@ -1823,8 +2062,24 @@
             <w:r>
               <w:rPr>
                 <w:rFonts w:ascii="Aptos Body" w:hAnsi="Aptos Body"/>
-              </w:rPr>
+                <w:b/>
+                <w:bCs/>
+              </w:rPr>
+              <w:lastRenderedPageBreak/>
               <w:t>Incremental Delivery</w:t>
+            </w:r>
+            <w:r>
+              <w:rPr>
+                <w:rFonts w:ascii="Aptos Body" w:hAnsi="Aptos Body"/>
+              </w:rPr>
+              <w:t xml:space="preserve"> </w:t>
+            </w:r>
+            <w:r>
+              <w:rPr>
+                <w:rFonts w:ascii="Aptos Body" w:hAnsi="Aptos Body"/>
+              </w:rPr>
+              <w:lastRenderedPageBreak/>
+              <w:t>because important features can be released early while additional features are developed later.</w:t>
             </w:r>
           </w:p>
         </w:tc>
@@ -2016,7 +2271,29 @@
               <w:rPr>
                 <w:rFonts w:ascii="Aptos Body" w:hAnsi="Aptos Body"/>
               </w:rPr>
-              <w:t>The Incremental Development Model is the most suitable lifecycle for Kina Ridge Primary School because the system can be delivered in small, useful stages. The school urgently needs a digital system to replace manual fee records, so providing a working payment recording system first gives immediate value. The bursar and headmaster are available to review each increment and suggest improvements before the next stage is developed. This approach reduces the risk of building features that do not meet the school's needs.</w:t>
+              <w:t xml:space="preserve">The most appropriate lifecycle for Kina Ridge Primary School is </w:t>
+            </w:r>
+            <w:r>
+              <w:rPr>
+                <w:rFonts w:ascii="Aptos Body" w:hAnsi="Aptos Body"/>
+                <w:b/>
+                <w:bCs/>
+              </w:rPr>
+              <w:t>Incremental Development supported by Waterfall testing and documentation</w:t>
+            </w:r>
+            <w:r>
+              <w:rPr>
+                <w:rFonts w:ascii="Aptos Body" w:hAnsi="Aptos Body"/>
+                <w:b/>
+                <w:bCs/>
+              </w:rPr>
+              <w:t xml:space="preserve"> </w:t>
+            </w:r>
+            <w:r>
+              <w:rPr>
+                <w:rFonts w:ascii="Aptos Body" w:hAnsi="Aptos Body"/>
+              </w:rPr>
+              <w:t>because the system can be delivered in small, useful stages. The school urgently needs a digital system to replace manual fee records, so providing a working payment recording system first gives immediate value. The bursar and headmaster are available to review each increment and suggest improvements before the next stage is developed. This approach reduces the risk of building features that do not meet the school's needs.</w:t>
             </w:r>
           </w:p>
           <w:p>
@@ -2030,7 +2307,6 @@
               <w:rPr>
                 <w:rFonts w:ascii="Aptos Body" w:hAnsi="Aptos Body"/>
               </w:rPr>
-              <w:lastRenderedPageBreak/>
               <w:t>Some project activities, such as documentation, testing, and final validation, will follow Waterfall practices to ensure that financial records are accurate and reliable before deployment. Since payment information is sensitive, careful testing is essential.</w:t>
             </w:r>
           </w:p>
@@ -2047,16 +2323,6 @@
               </w:rPr>
               <w:t>One factor against using Incremental Development is that changes requested after each release may increase development time. This risk will be managed by clearly defining the scope of each increment and obtaining client approval before moving to the next stage. Combining incremental delivery with structured testing provides both flexibility and reliability.</w:t>
             </w:r>
-          </w:p>
-          <w:p>
-            <w:pPr>
-              <w:spacing w:line="259" w:lineRule="auto"/>
-              <w:rPr>
-                <w:rFonts w:ascii="Aptos Body" w:eastAsia="Times New Roman" w:hAnsi="Aptos Body" w:cs="Times New Roman"/>
-                <w:color w:val="000000"/>
-                <w:sz w:val="21"/>
-              </w:rPr>
-            </w:pPr>
           </w:p>
         </w:tc>
       </w:tr>
@@ -2094,7 +2360,6 @@
                 <w:color w:val="000000"/>
                 <w:sz w:val="21"/>
               </w:rPr>
-              <w:lastRenderedPageBreak/>
               <w:t xml:space="preserve">Blends are professional, not a cop-out. </w:t>
             </w:r>
             <w:r>
@@ -2452,17 +2717,16 @@
             </w:pPr>
             <w:r>
               <w:rPr>
-                <w:rFonts w:ascii="Aptos Body" w:eastAsia="Times New Roman" w:hAnsi="Aptos Body" w:cs="Times New Roman"/>
-                <w:color w:val="000000"/>
-                <w:sz w:val="21"/>
-              </w:rPr>
-              <w:t xml:space="preserve"> </w:t>
-            </w:r>
-            <w:r>
-              <w:rPr>
                 <w:rFonts w:ascii="Aptos Body" w:hAnsi="Aptos Body"/>
               </w:rPr>
-              <w:t>This provides immediate value because the school can begin recording payments electronically from the first release.</w:t>
+              <w:t xml:space="preserve">This provides immediate value because the school can begin recording payments </w:t>
+            </w:r>
+            <w:r>
+              <w:rPr>
+                <w:rFonts w:ascii="Aptos Body" w:hAnsi="Aptos Body"/>
+              </w:rPr>
+              <w:lastRenderedPageBreak/>
+              <w:t>electronically from the first release.</w:t>
             </w:r>
           </w:p>
         </w:tc>
@@ -2486,19 +2750,12 @@
                 <w:sz w:val="21"/>
               </w:rPr>
             </w:pPr>
-            <w:r>
-              <w:rPr>
-                <w:rFonts w:ascii="Aptos Body" w:eastAsia="Times New Roman" w:hAnsi="Aptos Body" w:cs="Times New Roman"/>
-                <w:color w:val="000000"/>
-                <w:sz w:val="21"/>
-              </w:rPr>
-              <w:t xml:space="preserve"> </w:t>
-            </w:r>
             <w:r>
               <w:rPr>
                 <w:rStyle w:val="Strong"/>
                 <w:rFonts w:ascii="Aptos Body" w:hAnsi="Aptos Body"/>
               </w:rPr>
+              <w:lastRenderedPageBreak/>
               <w:t>3 weeks</w:t>
             </w:r>
             <w:r>
@@ -3007,8 +3264,19 @@
               <w:rPr>
                 <w:rFonts w:ascii="Aptos Body" w:hAnsi="Aptos Body"/>
               </w:rPr>
-              <w:lastRenderedPageBreak/>
-              <w:t>Power outages require the system to work offline and allow data entry without internet access.</w:t>
+              <w:t xml:space="preserve">Power </w:t>
+            </w:r>
+            <w:r>
+              <w:rPr>
+                <w:rFonts w:ascii="Aptos Body" w:hAnsi="Aptos Body"/>
+              </w:rPr>
+              <w:t>interruptions</w:t>
+            </w:r>
+            <w:r>
+              <w:rPr>
+                <w:rFonts w:ascii="Aptos Body" w:hAnsi="Aptos Body"/>
+              </w:rPr>
+              <w:t xml:space="preserve"> require the system to work offline and allow data entry without internet access.</w:t>
             </w:r>
           </w:p>
           <w:p>
@@ -3072,7 +3340,19 @@
               <w:rPr>
                 <w:rFonts w:ascii="Aptos Body" w:hAnsi="Aptos Body"/>
               </w:rPr>
-              <w:t>Final approval must be obtained from the Board of Governors before the system is fully implemented.</w:t>
+              <w:t>Final approval must be obtained from the</w:t>
+            </w:r>
+            <w:r>
+              <w:rPr>
+                <w:rFonts w:ascii="Aptos Body" w:hAnsi="Aptos Body"/>
+              </w:rPr>
+              <w:t xml:space="preserve"> School</w:t>
+            </w:r>
+            <w:r>
+              <w:rPr>
+                <w:rFonts w:ascii="Aptos Body" w:hAnsi="Aptos Body"/>
+              </w:rPr>
+              <w:t xml:space="preserve"> Board of Governors before the system is fully implemented.</w:t>
             </w:r>
           </w:p>
         </w:tc>
@@ -3249,6 +3529,7 @@
                 <w:color w:val="222831"/>
                 <w:sz w:val="20"/>
               </w:rPr>
+              <w:lastRenderedPageBreak/>
               <w:t xml:space="preserve"> </w:t>
             </w:r>
             <w:r>
@@ -4882,7 +5163,6 @@
   <w:style w:type="character" w:default="1" w:styleId="DefaultParagraphFont">
     <w:name w:val="Default Paragraph Font"/>
     <w:uiPriority w:val="1"/>
-    <w:semiHidden/>
     <w:unhideWhenUsed/>
   </w:style>
   <w:style w:type="table" w:default="1" w:styleId="TableNormal">
@@ -5231,7 +5511,6 @@
     <w:name w:val="Normal (Web)"/>
     <w:basedOn w:val="Normal"/>
     <w:uiPriority w:val="99"/>
-    <w:semiHidden/>
     <w:unhideWhenUsed/>
     <w:rsid w:val="001371AB"/>
     <w:pPr>

</xml_diff>